<commit_message>
Update corresponding email to en289s@missouristate.edu; rebuild preprints
</commit_message>
<xml_diff>
--- a/paper/eartharxiv/Nani_2026_FARS_rural_urban_EarthArXiv_preprint.docx
+++ b/paper/eartharxiv/Nani_2026_FARS_rural_urban_EarthArXiv_preprint.docx
@@ -90,7 +90,7 @@
           <w:i w:val="0"/>
           <w:sz w:val="24"/>
         </w:rPr>
-        <w:t>Correspondence: otiemmanuelnani@gmail.com</w:t>
+        <w:t>Correspondence: en289s@missouristate.edu</w:t>
       </w:r>
     </w:p>
     <w:p>
@@ -173,7 +173,7 @@
           <w:i w:val="0"/>
           <w:sz w:val="22"/>
         </w:rPr>
-        <w:t>Independent Researcher, Springfield, Missouri, USA  |  https://orcid.org/0009-0009-4175-8962  |  otiemmanuelnani@gmail.com</w:t>
+        <w:t>Independent Researcher, Springfield, Missouri, USA  |  https://orcid.org/0009-0009-4175-8962  |  en289s@missouristate.edu</w:t>
       </w:r>
     </w:p>
     <w:p>

</xml_diff>